<commit_message>
vault backup: 2026-04-24 11:08:58
</commit_message>
<xml_diff>
--- a/Temas/05_DoctrinasFundamentales/01_Libros/Nacer de Nuevo_ Versión Final tamaño carta.docx
+++ b/Temas/05_DoctrinasFundamentales/01_Libros/Nacer de Nuevo_ Versión Final tamaño carta.docx
@@ -8284,7 +8284,7 @@
               </wp:anchor>
             </w:drawing>
           </mc:Choice>
-          <mc:Fallback xmlns:cr="http://schemas.microsoft.com/office/comments/2020/reactions" xmlns="http://schemas.microsoft.com/office/tasks/2019/documenttasks" xmlns:dgm="http://schemas.openxmlformats.org/drawingml/2006/diagram" xmlns:lc="http://schemas.openxmlformats.org/drawingml/2006/lockedCanvas" xmlns:c="http://schemas.openxmlformats.org/drawingml/2006/chart" xmlns:pic="http://schemas.openxmlformats.org/drawingml/2006/picture" xmlns:a="http://schemas.openxmlformats.org/drawingml/2006/main" xmlns:sl="http://schemas.openxmlformats.org/schemaLibrary/2006/main">
+          <mc:Fallback xmlns:sl="http://schemas.openxmlformats.org/schemaLibrary/2006/main" xmlns:a="http://schemas.openxmlformats.org/drawingml/2006/main" xmlns:pic="http://schemas.openxmlformats.org/drawingml/2006/picture" xmlns:c="http://schemas.openxmlformats.org/drawingml/2006/chart" xmlns:lc="http://schemas.openxmlformats.org/drawingml/2006/lockedCanvas" xmlns:dgm="http://schemas.openxmlformats.org/drawingml/2006/diagram" xmlns="http://schemas.microsoft.com/office/tasks/2019/documenttasks" xmlns:cr="http://schemas.microsoft.com/office/comments/2020/reactions">
             <w:drawing>
               <wp:anchor allowOverlap="1" behindDoc="1" distB="0" distT="0" distL="0" distR="0" hidden="0" layoutInCell="1" locked="0" relativeHeight="0" simplePos="0">
                 <wp:simplePos x="0" y="0"/>
@@ -8415,7 +8415,7 @@
               </wp:anchor>
             </w:drawing>
           </mc:Choice>
-          <mc:Fallback xmlns:cr="http://schemas.microsoft.com/office/comments/2020/reactions" xmlns="http://schemas.microsoft.com/office/tasks/2019/documenttasks" xmlns:dgm="http://schemas.openxmlformats.org/drawingml/2006/diagram" xmlns:lc="http://schemas.openxmlformats.org/drawingml/2006/lockedCanvas" xmlns:c="http://schemas.openxmlformats.org/drawingml/2006/chart" xmlns:pic="http://schemas.openxmlformats.org/drawingml/2006/picture" xmlns:a="http://schemas.openxmlformats.org/drawingml/2006/main" xmlns:sl="http://schemas.openxmlformats.org/schemaLibrary/2006/main">
+          <mc:Fallback xmlns:sl="http://schemas.openxmlformats.org/schemaLibrary/2006/main" xmlns:a="http://schemas.openxmlformats.org/drawingml/2006/main" xmlns:pic="http://schemas.openxmlformats.org/drawingml/2006/picture" xmlns:c="http://schemas.openxmlformats.org/drawingml/2006/chart" xmlns:lc="http://schemas.openxmlformats.org/drawingml/2006/lockedCanvas" xmlns:dgm="http://schemas.openxmlformats.org/drawingml/2006/diagram" xmlns="http://schemas.microsoft.com/office/tasks/2019/documenttasks" xmlns:cr="http://schemas.microsoft.com/office/comments/2020/reactions">
             <w:drawing>
               <wp:anchor allowOverlap="1" behindDoc="1" distB="0" distT="0" distL="0" distR="0" hidden="0" layoutInCell="1" locked="0" relativeHeight="0" simplePos="0">
                 <wp:simplePos x="0" y="0"/>
@@ -18290,28 +18290,7 @@
           <w:rFonts w:ascii="Garamond" w:hAnsi="Garamond"/>
           <w:lang w:val="es-ES"/>
         </w:rPr>
-        <w:t>Espíritu Santo al arrepentimiento, a la satisfacción que trae el arrepentimiento, a la reconciliación otorgada por la justicia de Cristo</w:t>
-      </w:r>
-      <w:r>
-        <w:rPr>
-          <w:rFonts w:ascii="Garamond" w:hAnsi="Garamond"/>
-          <w:lang w:val="es-ES"/>
-        </w:rPr>
-        <w:t>.</w:t>
-      </w:r>
-      <w:r>
-        <w:rPr>
-          <w:rFonts w:ascii="Garamond" w:hAnsi="Garamond"/>
-          <w:lang w:val="es-ES"/>
-        </w:rPr>
-        <w:t xml:space="preserve"> Señor</w:t>
-      </w:r>
-      <w:r>
-        <w:rPr>
-          <w:rFonts w:ascii="Garamond" w:hAnsi="Garamond"/>
-          <w:lang w:val="es-ES"/>
-        </w:rPr>
-        <w:t xml:space="preserve">, oramos para </w:t>
+        <w:t xml:space="preserve">Espíritu Santo al arrepentimiento, a la satisfacción que trae el arrepentimiento, a la reconciliación otorgada por la justicia de Cristo. Señor, oramos para </w:t>
       </w:r>
       <w:r>
         <w:rPr>
@@ -20493,6 +20472,28 @@
 </a:theme>
 </file>
 
+<file path=word/webextensions/taskpanes.xml><?xml version="1.0" encoding="utf-8"?>
+<wetp:taskpanes xmlns:wetp="http://schemas.microsoft.com/office/webextensions/taskpanes/2010/11">
+  <wetp:taskpane dockstate="right" visibility="0" width="350" row="0">
+    <wetp:webextensionref xmlns:r="http://schemas.openxmlformats.org/officeDocument/2006/relationships" r:id="rId1"/>
+  </wetp:taskpane>
+</wetp:taskpanes>
+</file>
+
+<file path=word/webextensions/webextension1.xml><?xml version="1.0" encoding="utf-8"?>
+<we:webextension xmlns:we="http://schemas.microsoft.com/office/webextensions/webextension/2010/11" id="{DFE6236B-0E8E-FB41-AF75-F8E6FA4758EE}">
+  <we:reference id="WA200010453" version="1.0.0.1" store="Omex" storeType="OMEX"/>
+  <we:alternateReferences>
+    <we:reference id="WA200010453" version="1.0.0.1" store="WA200010453" storeType="OMEX"/>
+  </we:alternateReferences>
+  <we:properties>
+    <we:property name="claude.fileId" value="&quot;50a80b87-763b-4525-b59c-60e575431c6e&quot;"/>
+  </we:properties>
+  <we:bindings/>
+  <we:snapshot xmlns:r="http://schemas.openxmlformats.org/officeDocument/2006/relationships"/>
+</we:webextension>
+</file>
+
 <file path=customXml/item1.xml><?xml version="1.0" encoding="utf-8"?>
 <b:Sources xmlns:b="http://schemas.openxmlformats.org/officeDocument/2006/bibliography" xmlns="http://schemas.openxmlformats.org/officeDocument/2006/bibliography" SelectedStyle="/APASixthEditionOfficeOnline.xsl" StyleName="APA" Version="6"/>
 </file>

</xml_diff>